<commit_message>
Point report to narrated video (md and docx)
Co-authored-by: Copilot <223556219+Copilot@users.noreply.github.com>
</commit_message>
<xml_diff>
--- a/docs/relatorio_executivo_fase2.docx
+++ b/docs/relatorio_executivo_fase2.docx
@@ -23,7 +23,7 @@
         <w:rPr>
           <w:b/>
         </w:rPr>
-        <w:t>Vídeo executivo (4 min 57 s):</w:t>
+        <w:t>Vídeo executivo (5 min 7 s):</w:t>
       </w:r>
       <w:r>
         <w:t xml:space="preserve"> </w:t>
@@ -1859,7 +1859,7 @@
     </w:p>
     <w:p>
       <w:r>
-        <w:t xml:space="preserve">Apresentação de 4 min 57 sutos para os executivos que aprovarão o investimento (roteiro em </w:t>
+        <w:t xml:space="preserve">Apresentação de 5 min 7 sutos para os executivos que aprovarão o investimento (roteiro em </w:t>
       </w:r>
       <w:r>
         <w:rPr>

</xml_diff>